<commit_message>
Update resume: add beagle project, NGINX/HAProxy, dash cleanup
Co-Authored-By: Claude Opus 4.8 <noreply@anthropic.com>
</commit_message>
<xml_diff>
--- a/resumes/Matthew_Myrick_Resume.docx
+++ b/resumes/Matthew_Myrick_Resume.docx
@@ -546,6 +546,35 @@
           <w:szCs w:val="20"/>
         </w:rPr>
         <w:t xml:space="preserve">PROJECTS</w:t>
+      </w:r>
+    </w:p>
+    <w:p>
+      <w:pPr>
+        <w:spacing w:before="0" w:after="20" w:line="240" w:lineRule="auto"/>
+        <w:ind w:left="250" w:hanging="180"/>
+      </w:pPr>
+      <w:r>
+        <w:rPr>
+          <w:sz w:val="18"/>
+          <w:szCs w:val="18"/>
+        </w:rPr>
+        <w:t xml:space="preserve">•  </w:t>
+      </w:r>
+      <w:r>
+        <w:rPr>
+          <w:b/>
+          <w:i/>
+          <w:sz w:val="18"/>
+          <w:szCs w:val="18"/>
+        </w:rPr>
+        <w:t xml:space="preserve">beagle</w:t>
+      </w:r>
+      <w:r>
+        <w:rPr>
+          <w:sz w:val="18"/>
+          <w:szCs w:val="18"/>
+        </w:rPr>
+        <w:t xml:space="preserve">: AI-first incident RCA terminal UI (Rust); Claude investigates a system from its telemetry and writes up the root cause, rendered live as a tabbed incident view.</w:t>
       </w:r>
     </w:p>
     <w:p>

</xml_diff>